<commit_message>
Completa a qualificação da Contratada e registra a chave PIX
- Qualificação passa a trazer nacionalidade, data de nascimento,
  naturalidade e o órgão expedidor do RG, conforme a cédula apresentada.
- Cláusula 6.3 indica a chave PIX aleatória de recebimento.
- Nova Cláusula 6.3.3: a Contratada declara que a chave está vinculada a
  conta da pessoa jurídica, e alterações de conta ou chave passam por
  comunicação escrita e confirmação antes do pagamento seguinte.
- Checklist registra a chave e mantém em aberto a conferência da
  titularidade, já que chave aleatória não revela o titular.

Co-Authored-By: Claude Opus 5 <noreply@anthropic.com>
Claude-Session: https://claude.ai/code/session_01JvuJwy7yY4EnoYMkQynCaG
</commit_message>
<xml_diff>
--- a/docs/juridico/acordo-formalizado-zeladoria.docx
+++ b/docs/juridico/acordo-formalizado-zeladoria.docx
@@ -117,7 +117,31 @@
         <w:rPr>
           <w:b w:val="0"/>
         </w:rPr>
-        <w:t>, RG 46.270.985-1, CPF 386.386.288-03.</w:t>
+        <w:t xml:space="preserve">, brasileira, nascida em 31 de março de 1990, natural de São José do Rio Preto/SP, portadora da Cédula de Identidade RG nº </w:t>
+      </w:r>
+      <w:r>
+        <w:rPr>
+          <w:b/>
+        </w:rPr>
+        <w:t>46.270.985-1 SSP/SP</w:t>
+      </w:r>
+      <w:r>
+        <w:rPr>
+          <w:b w:val="0"/>
+        </w:rPr>
+        <w:t xml:space="preserve">, expedida em 07/03/2023, e inscrita no CPF sob o nº </w:t>
+      </w:r>
+      <w:r>
+        <w:rPr>
+          <w:b/>
+        </w:rPr>
+        <w:t>386.386.288-03</w:t>
+      </w:r>
+      <w:r>
+        <w:rPr>
+          <w:b w:val="0"/>
+        </w:rPr>
+        <w:t>.</w:t>
       </w:r>
     </w:p>
     <w:p>
@@ -1323,6 +1347,18 @@
         <w:rPr>
           <w:b w:val="0"/>
         </w:rPr>
+        <w:t xml:space="preserve">, chave PIX aleatória </w:t>
+      </w:r>
+      <w:r>
+        <w:rPr>
+          <w:b/>
+        </w:rPr>
+        <w:t>3d93dbc3-abb3-4361-adfb-beba493bbffe</w:t>
+      </w:r>
+      <w:r>
+        <w:rPr>
+          <w:b w:val="0"/>
+        </w:rPr>
         <w:t>. Não haverá pagamento em espécie, em conta de pessoa física, nem parcelado em datas semanais ou quinzenais.</w:t>
       </w:r>
     </w:p>
@@ -1388,6 +1424,32 @@
           <w:b w:val="0"/>
         </w:rPr>
         <w:t>, sem exceção, ainda que o pagamento tenha sido feito antes da entrega. O recibo é a peça que registra a autonomia da prestação e a quitação do período.</w:t>
+      </w:r>
+    </w:p>
+    <w:p>
+      <w:r>
+        <w:rPr>
+          <w:b/>
+        </w:rPr>
+        <w:t>6.3.3.</w:t>
+      </w:r>
+      <w:r>
+        <w:rPr>
+          <w:b w:val="0"/>
+        </w:rPr>
+        <w:t xml:space="preserve"> A CONTRATADA </w:t>
+      </w:r>
+      <w:r>
+        <w:rPr>
+          <w:b/>
+        </w:rPr>
+        <w:t>declara que a chave PIX indicada no item 6.3 está vinculada a conta de titularidade da pessoa jurídica</w:t>
+      </w:r>
+      <w:r>
+        <w:rPr>
+          <w:b w:val="0"/>
+        </w:rPr>
+        <w:t xml:space="preserve"> CNPJ 19.525.600/0001-00. Qualquer alteração de conta ou de chave será comunicada por escrito e confirmada pela CONTRATANTE antes do pagamento seguinte.</w:t>
       </w:r>
     </w:p>
     <w:p>

</xml_diff>

<commit_message>
Conclui a conferência da conta de recebimento
Comprovante de 05/09/2026 confirma que a chave PIX aleatória está
vinculada à conta da pessoa jurídica: recebedor 19525600 CAMILA RABELO
GLICERIO GOIS, CNPJ terminado em 00, no Nu Pagamentos.

- Cláusula 6.3 passa a indicar a instituição da conta de recebimento.
- Checklist marca o item como resolvido, com a data da conferência.

Co-Authored-By: Claude Opus 5 <noreply@anthropic.com>
Claude-Session: https://claude.ai/code/session_01JvuJwy7yY4EnoYMkQynCaG
</commit_message>
<xml_diff>
--- a/docs/juridico/acordo-formalizado-zeladoria.docx
+++ b/docs/juridico/acordo-formalizado-zeladoria.docx
@@ -1354,6 +1354,18 @@
           <w:b/>
         </w:rPr>
         <w:t>3d93dbc3-abb3-4361-adfb-beba493bbffe</w:t>
+      </w:r>
+      <w:r>
+        <w:rPr>
+          <w:b w:val="0"/>
+        </w:rPr>
+        <w:t xml:space="preserve">, mantida junto ao </w:t>
+      </w:r>
+      <w:r>
+        <w:rPr>
+          <w:b/>
+        </w:rPr>
+        <w:t>Nu Pagamentos S.A. — Instituição de Pagamento</w:t>
       </w:r>
       <w:r>
         <w:rPr>

</xml_diff>

<commit_message>
Retroage a vigência a 01/06/2026 e emite os recibos do período
A prestação começou em 1º de junho de 2026 e três competências foram
pagas apenas por PIX, sem nota fiscal e sem recibo. Deixar esse período
sem documento é deixar à vista pagamentos mensais sem qualificação.

- Cláusula 10.1: vigência de doze meses contados de 01/06/2026, com
  término em 31/05/2027.
- Nova Cláusula 12.1: ratificação do período anterior, declarando o
  início da prestação, as condições em que se deu e as competências de
  junho, julho e agosto como quitadas, com obrigação de emitir as notas
  fiscais correspondentes. Itens seguintes renumerados.
- Novo documento com os três recibos, um por competência, já com os
  valores e, no de agosto, o identificador do PIX de 05/09/2026.

Co-Authored-By: Claude Opus 5 <noreply@anthropic.com>
Claude-Session: https://claude.ai/code/session_01JvuJwy7yY4EnoYMkQynCaG
</commit_message>
<xml_diff>
--- a/docs/juridico/acordo-formalizado-zeladoria.docx
+++ b/docs/juridico/acordo-formalizado-zeladoria.docx
@@ -2235,19 +2235,19 @@
         <w:rPr>
           <w:b w:val="0"/>
         </w:rPr>
-        <w:t xml:space="preserve"> O acordo começa a valer </w:t>
+        <w:t xml:space="preserve"> Este acordo </w:t>
       </w:r>
       <w:r>
         <w:rPr>
           <w:b/>
         </w:rPr>
-        <w:t>na data de sua assinatura</w:t>
+        <w:t>formaliza a prestação de serviços iniciada em 1º de junho de 2026</w:t>
       </w:r>
       <w:r>
         <w:rPr>
           <w:b w:val="0"/>
         </w:rPr>
-        <w:t xml:space="preserve"> e vale por </w:t>
+        <w:t xml:space="preserve"> e vigora por </w:t>
       </w:r>
       <w:r>
         <w:rPr>
@@ -2259,7 +2259,19 @@
         <w:rPr>
           <w:b w:val="0"/>
         </w:rPr>
-        <w:t>, renovando-se automaticamente por períodos iguais se nenhuma das Partes avisar o contrário.</w:t>
+        <w:t xml:space="preserve"> contados dessa data, encerrando-se em </w:t>
+      </w:r>
+      <w:r>
+        <w:rPr>
+          <w:b/>
+        </w:rPr>
+        <w:t>31 de maio de 2027</w:t>
+      </w:r>
+      <w:r>
+        <w:rPr>
+          <w:b w:val="0"/>
+        </w:rPr>
+        <w:t>, e renovando-se automaticamente por períodos iguais se nenhuma das Partes avisar o contrário.</w:t>
       </w:r>
     </w:p>
     <w:p>
@@ -2829,49 +2841,49 @@
         <w:rPr>
           <w:b/>
         </w:rPr>
-        <w:t>12.1.</w:t>
+        <w:t>12.1. Ratificação do período anterior.</w:t>
       </w:r>
       <w:r>
         <w:rPr>
           <w:b w:val="0"/>
         </w:rPr>
-        <w:t xml:space="preserve"> Este acordo, com o </w:t>
+        <w:t xml:space="preserve"> As Partes declaram que a prestação de serviços teve início em </w:t>
       </w:r>
       <w:r>
         <w:rPr>
           <w:b/>
         </w:rPr>
-        <w:t>Plano de Cobertura</w:t>
+        <w:t>1º de junho de 2026</w:t>
       </w:r>
       <w:r>
         <w:rPr>
           <w:b w:val="0"/>
         </w:rPr>
-        <w:t xml:space="preserve"> e o </w:t>
+        <w:t xml:space="preserve"> e vem sendo executada desde então nos mesmos termos ora formalizados — com autonomia e organização próprias da CONTRATADA, sem subordinação, pessoalidade ou exclusividade, e mediante pagamento mensal à sua empresa. As Partes </w:t>
       </w:r>
       <w:r>
         <w:rPr>
           <w:b/>
         </w:rPr>
-        <w:t>Recibo Mensal</w:t>
+        <w:t>ratificam expressamente</w:t>
       </w:r>
       <w:r>
         <w:rPr>
           <w:b w:val="0"/>
         </w:rPr>
-        <w:t xml:space="preserve"> anexos, reúne tudo o que foi combinado e só muda por </w:t>
+        <w:t xml:space="preserve"> as competências de </w:t>
       </w:r>
       <w:r>
         <w:rPr>
           <w:b/>
         </w:rPr>
-        <w:t>aditivo escrito</w:t>
+        <w:t>junho, julho e agosto de 2026</w:t>
       </w:r>
       <w:r>
         <w:rPr>
           <w:b w:val="0"/>
         </w:rPr>
-        <w:t>. Tolerar um descumprimento uma vez não significa aceitar que se repita.</w:t>
+        <w:t>, já quitadas, cujos recibos são firmados em apartado, obrigando-se a CONTRATADA a emitir as notas fiscais correspondentes. Nada é devido, por qualquer das Partes, em relação ao período ratificado.</w:t>
       </w:r>
     </w:p>
     <w:p>
@@ -2879,25 +2891,49 @@
         <w:rPr>
           <w:b/>
         </w:rPr>
-        <w:t>12.2. Aviso de mudança.</w:t>
+        <w:t>12.2.</w:t>
       </w:r>
       <w:r>
         <w:rPr>
           <w:b w:val="0"/>
         </w:rPr>
-        <w:t xml:space="preserve"> Qualquer mudança relevante nas condições deste acordo, no escopo dos serviços ou no uso das instalações deverá ser comunicada pela Parte interessada à outra </w:t>
+        <w:t xml:space="preserve"> Este acordo, com o </w:t>
       </w:r>
       <w:r>
         <w:rPr>
           <w:b/>
         </w:rPr>
-        <w:t>por escrito e com 30 (trinta) dias de antecedência</w:t>
+        <w:t>Plano de Cobertura</w:t>
       </w:r>
       <w:r>
         <w:rPr>
           <w:b w:val="0"/>
         </w:rPr>
-        <w:t>, admitida a notificação extrajudicial. A mudança só passa a valer após esse prazo e mediante aditivo assinado pelas duas Partes, salvo se ambas concordarem em antecipar.</w:t>
+        <w:t xml:space="preserve"> e o </w:t>
+      </w:r>
+      <w:r>
+        <w:rPr>
+          <w:b/>
+        </w:rPr>
+        <w:t>Recibo Mensal</w:t>
+      </w:r>
+      <w:r>
+        <w:rPr>
+          <w:b w:val="0"/>
+        </w:rPr>
+        <w:t xml:space="preserve"> anexos, reúne tudo o que foi combinado e só muda por </w:t>
+      </w:r>
+      <w:r>
+        <w:rPr>
+          <w:b/>
+        </w:rPr>
+        <w:t>aditivo escrito</w:t>
+      </w:r>
+      <w:r>
+        <w:rPr>
+          <w:b w:val="0"/>
+        </w:rPr>
+        <w:t>. Tolerar um descumprimento uma vez não significa aceitar que se repita.</w:t>
       </w:r>
     </w:p>
     <w:p>
@@ -2905,37 +2941,25 @@
         <w:rPr>
           <w:b/>
         </w:rPr>
-        <w:t>12.3.</w:t>
+        <w:t>12.3. Aviso de mudança.</w:t>
       </w:r>
       <w:r>
         <w:rPr>
           <w:b w:val="0"/>
         </w:rPr>
-        <w:t xml:space="preserve"> As comunicações valem por escrito, por e-mail com confirmação: </w:t>
+        <w:t xml:space="preserve"> Qualquer mudança relevante nas condições deste acordo, no escopo dos serviços ou no uso das instalações deverá ser comunicada pela Parte interessada à outra </w:t>
       </w:r>
       <w:r>
         <w:rPr>
           <w:b/>
         </w:rPr>
-        <w:t>CONTRATANTE</w:t>
+        <w:t>por escrito e com 30 (trinta) dias de antecedência</w:t>
       </w:r>
       <w:r>
         <w:rPr>
           <w:b w:val="0"/>
         </w:rPr>
-        <w:t xml:space="preserve"> — a.chaerk@gmail.com, (49) 9170-4545; </w:t>
-      </w:r>
-      <w:r>
-        <w:rPr>
-          <w:b/>
-        </w:rPr>
-        <w:t>CONTRATADA</w:t>
-      </w:r>
-      <w:r>
-        <w:rPr>
-          <w:b w:val="0"/>
-        </w:rPr>
-        <w:t xml:space="preserve"> — ilhadosabor.sc@gmail.com, +55 (48) 99223-2826.</w:t>
+        <w:t>, admitida a notificação extrajudicial. A mudança só passa a valer após esse prazo e mediante aditivo assinado pelas duas Partes, salvo se ambas concordarem em antecipar.</w:t>
       </w:r>
     </w:p>
     <w:p>
@@ -2949,7 +2973,31 @@
         <w:rPr>
           <w:b w:val="0"/>
         </w:rPr>
-        <w:t xml:space="preserve"> Nenhuma das Partes pode transferir este acordo a terceiros sem a concordância da outra.</w:t>
+        <w:t xml:space="preserve"> As comunicações valem por escrito, por e-mail com confirmação: </w:t>
+      </w:r>
+      <w:r>
+        <w:rPr>
+          <w:b/>
+        </w:rPr>
+        <w:t>CONTRATANTE</w:t>
+      </w:r>
+      <w:r>
+        <w:rPr>
+          <w:b w:val="0"/>
+        </w:rPr>
+        <w:t xml:space="preserve"> — a.chaerk@gmail.com, (49) 9170-4545; </w:t>
+      </w:r>
+      <w:r>
+        <w:rPr>
+          <w:b/>
+        </w:rPr>
+        <w:t>CONTRATADA</w:t>
+      </w:r>
+      <w:r>
+        <w:rPr>
+          <w:b w:val="0"/>
+        </w:rPr>
+        <w:t xml:space="preserve"> — ilhadosabor.sc@gmail.com, +55 (48) 99223-2826.</w:t>
       </w:r>
     </w:p>
     <w:p>
@@ -2963,7 +3011,7 @@
         <w:rPr>
           <w:b w:val="0"/>
         </w:rPr>
-        <w:t xml:space="preserve"> Se alguma cláusula for considerada inválida, as demais continuam valendo.</w:t>
+        <w:t xml:space="preserve"> Nenhuma das Partes pode transferir este acordo a terceiros sem a concordância da outra.</w:t>
       </w:r>
     </w:p>
     <w:p>
@@ -2977,7 +3025,7 @@
         <w:rPr>
           <w:b w:val="0"/>
         </w:rPr>
-        <w:t xml:space="preserve"> As Partes negociaram livremente estes termos, em acordo empresarial entre iguais (arts. 421, 421-A e 422 do Código Civil).</w:t>
+        <w:t xml:space="preserve"> Se alguma cláusula for considerada inválida, as demais continuam valendo.</w:t>
       </w:r>
     </w:p>
     <w:p>
@@ -2991,31 +3039,7 @@
         <w:rPr>
           <w:b w:val="0"/>
         </w:rPr>
-        <w:t xml:space="preserve"> Assinado por duas testemunhas, este acordo é </w:t>
-      </w:r>
-      <w:r>
-        <w:rPr>
-          <w:b/>
-        </w:rPr>
-        <w:t>título executivo extrajudicial</w:t>
-      </w:r>
-      <w:r>
-        <w:rPr>
-          <w:b w:val="0"/>
-        </w:rPr>
-        <w:t xml:space="preserve"> (art. 784, III, do CPC). As Partes aceitam </w:t>
-      </w:r>
-      <w:r>
-        <w:rPr>
-          <w:b/>
-        </w:rPr>
-        <w:t>assinatura eletrônica</w:t>
-      </w:r>
-      <w:r>
-        <w:rPr>
-          <w:b w:val="0"/>
-        </w:rPr>
-        <w:t xml:space="preserve"> (MP nº 2.200-2/2001 e Lei nº 14.063/2020).</w:t>
+        <w:t xml:space="preserve"> As Partes negociaram livremente estes termos, em acordo empresarial entre iguais (arts. 421, 421-A e 422 do Código Civil).</w:t>
       </w:r>
     </w:p>
     <w:p>
@@ -3024,6 +3048,44 @@
           <w:b/>
         </w:rPr>
         <w:t>12.8.</w:t>
+      </w:r>
+      <w:r>
+        <w:rPr>
+          <w:b w:val="0"/>
+        </w:rPr>
+        <w:t xml:space="preserve"> Assinado por duas testemunhas, este acordo é </w:t>
+      </w:r>
+      <w:r>
+        <w:rPr>
+          <w:b/>
+        </w:rPr>
+        <w:t>título executivo extrajudicial</w:t>
+      </w:r>
+      <w:r>
+        <w:rPr>
+          <w:b w:val="0"/>
+        </w:rPr>
+        <w:t xml:space="preserve"> (art. 784, III, do CPC). As Partes aceitam </w:t>
+      </w:r>
+      <w:r>
+        <w:rPr>
+          <w:b/>
+        </w:rPr>
+        <w:t>assinatura eletrônica</w:t>
+      </w:r>
+      <w:r>
+        <w:rPr>
+          <w:b w:val="0"/>
+        </w:rPr>
+        <w:t xml:space="preserve"> (MP nº 2.200-2/2001 e Lei nº 14.063/2020).</w:t>
+      </w:r>
+    </w:p>
+    <w:p>
+      <w:r>
+        <w:rPr>
+          <w:b/>
+        </w:rPr>
+        <w:t>12.9.</w:t>
       </w:r>
       <w:r>
         <w:rPr>

</xml_diff>